<commit_message>
Technical map: the module map by stage with the batch load per stage
</commit_message>
<xml_diff>
--- a/docs/reports/PF_technical_map_one_page.docx
+++ b/docs/reports/PF_technical_map_one_page.docx
@@ -3174,6 +3174,729 @@
         <w:t xml:space="preserve"> 10 different cv_common pins while `db_worker/ML_worker.py` is byte-identical in all 19 checkouts; two checkouts import helpers absent at their pin (PlaneArrivalDetector; departure / presence helpers); three DeepSORT id counters collide across classes and Kalman boxes are cast to int, so tracker boxes ≠ GM boxes; rows are joined by position, not frame id.</w:t>
       </w:r>
     </w:p>
+    <w:p>
+      <w:pPr>
+        <w:keepNext/>
+        <w:pBdr>
+          <w:bottom w:val="single" w:color="C9CDD3" w:sz="4" w:space="1"/>
+        </w:pBdr>
+        <w:spacing w:after="14" w:before="54" w:line="204"/>
+      </w:pPr>
+      <w:r>
+        <w:rPr>
+          <w:rFonts w:ascii="Calibri" w:cs="Calibri" w:eastAsia="Calibri" w:hAnsi="Calibri"/>
+          <w:b/>
+          <w:bCs/>
+          <w:color w:val="16213A"/>
+          <w:sz w:val="17"/>
+          <w:szCs w:val="17"/>
+        </w:rPr>
+        <w:t xml:space="preserve">5 · Module map by stage (window the module is active in · decision type · inputs · live ms per frame) and the batch load per stage</w:t>
+      </w:r>
+    </w:p>
+    <w:tbl>
+      <w:tblPr>
+        <w:tblW w:type="dxa" w:w="10866"/>
+        <w:tblBorders>
+          <w:top w:val="single" w:color="auto" w:sz="4"/>
+          <w:left w:val="single" w:color="auto" w:sz="4"/>
+          <w:bottom w:val="single" w:color="auto" w:sz="4"/>
+          <w:right w:val="single" w:color="auto" w:sz="4"/>
+          <w:insideH w:val="single" w:color="auto" w:sz="4"/>
+          <w:insideV w:val="single" w:color="auto" w:sz="4"/>
+        </w:tblBorders>
+        <w:tblLayout w:type="fixed"/>
+      </w:tblPr>
+      <w:tblGrid>
+        <w:gridCol w:w="1550"/>
+        <w:gridCol w:w="8266"/>
+        <w:gridCol w:w="1050"/>
+      </w:tblGrid>
+      <w:tr>
+        <w:trPr>
+          <w:tblHeader/>
+        </w:trPr>
+        <w:tc>
+          <w:tcPr>
+            <w:tcW w:type="dxa" w:w="1550"/>
+            <w:tcBorders>
+              <w:top w:val="single" w:color="C9CDD3" w:sz="3"/>
+              <w:left w:val="single" w:color="C9CDD3" w:sz="3"/>
+              <w:bottom w:val="single" w:color="C9CDD3" w:sz="3"/>
+              <w:right w:val="single" w:color="C9CDD3" w:sz="3"/>
+            </w:tcBorders>
+            <w:shd w:fill="E9ECF1" w:color="auto" w:val="clear"/>
+            <w:tcMar>
+              <w:top w:type="dxa" w:w="10"/>
+              <w:left w:type="dxa" w:w="42"/>
+              <w:bottom w:type="dxa" w:w="10"/>
+              <w:right w:type="dxa" w:w="42"/>
+            </w:tcMar>
+          </w:tcPr>
+          <w:p>
+            <w:pPr>
+              <w:spacing w:after="0" w:before="0" w:line="196"/>
+            </w:pPr>
+            <w:r>
+              <w:rPr>
+                <w:rFonts w:ascii="Calibri" w:cs="Calibri" w:eastAsia="Calibri" w:hAnsi="Calibri"/>
+                <w:b/>
+                <w:bCs/>
+                <w:sz w:val="13"/>
+                <w:szCs w:val="13"/>
+              </w:rPr>
+              <w:t xml:space="preserve">Stage</w:t>
+            </w:r>
+          </w:p>
+        </w:tc>
+        <w:tc>
+          <w:tcPr>
+            <w:tcW w:type="dxa" w:w="8266"/>
+            <w:tcBorders>
+              <w:top w:val="single" w:color="C9CDD3" w:sz="3"/>
+              <w:left w:val="single" w:color="C9CDD3" w:sz="3"/>
+              <w:bottom w:val="single" w:color="C9CDD3" w:sz="3"/>
+              <w:right w:val="single" w:color="C9CDD3" w:sz="3"/>
+            </w:tcBorders>
+            <w:shd w:fill="E9ECF1" w:color="auto" w:val="clear"/>
+            <w:tcMar>
+              <w:top w:type="dxa" w:w="10"/>
+              <w:left w:type="dxa" w:w="42"/>
+              <w:bottom w:type="dxa" w:w="10"/>
+              <w:right w:type="dxa" w:w="42"/>
+            </w:tcMar>
+          </w:tcPr>
+          <w:p>
+            <w:pPr>
+              <w:spacing w:after="0" w:before="0" w:line="196"/>
+            </w:pPr>
+            <w:r>
+              <w:rPr>
+                <w:rFonts w:ascii="Calibri" w:cs="Calibri" w:eastAsia="Calibri" w:hAnsi="Calibri"/>
+                <w:b/>
+                <w:bCs/>
+                <w:sz w:val="13"/>
+                <w:szCs w:val="13"/>
+              </w:rPr>
+              <w:t xml:space="preserve">Modules: window, decision (INSTANT one detection → Fail · EVENT verdict at the event · DEADLINE Fail if not seen by T · LOOKBACK window before T · WHOLE the whole event), inputs, live ms</w:t>
+            </w:r>
+          </w:p>
+        </w:tc>
+        <w:tc>
+          <w:tcPr>
+            <w:tcW w:type="dxa" w:w="1050"/>
+            <w:tcBorders>
+              <w:top w:val="single" w:color="C9CDD3" w:sz="3"/>
+              <w:left w:val="single" w:color="C9CDD3" w:sz="3"/>
+              <w:bottom w:val="single" w:color="C9CDD3" w:sz="3"/>
+              <w:right w:val="single" w:color="C9CDD3" w:sz="3"/>
+            </w:tcBorders>
+            <w:shd w:fill="E9ECF1" w:color="auto" w:val="clear"/>
+            <w:tcMar>
+              <w:top w:type="dxa" w:w="10"/>
+              <w:left w:type="dxa" w:w="42"/>
+              <w:bottom w:type="dxa" w:w="10"/>
+              <w:right w:type="dxa" w:w="42"/>
+            </w:tcMar>
+          </w:tcPr>
+          <w:p>
+            <w:pPr>
+              <w:spacing w:after="0" w:before="0" w:line="196"/>
+            </w:pPr>
+            <w:r>
+              <w:rPr>
+                <w:rFonts w:ascii="Calibri" w:cs="Calibri" w:eastAsia="Calibri" w:hAnsi="Calibri"/>
+                <w:b/>
+                <w:bCs/>
+                <w:sz w:val="13"/>
+                <w:szCs w:val="13"/>
+              </w:rPr>
+              <w:t xml:space="preserve">batch ms per recorded frame, sum</w:t>
+            </w:r>
+          </w:p>
+        </w:tc>
+      </w:tr>
+      <w:tr>
+        <w:trPr>
+          <w:tblHeader w:val="off"/>
+        </w:trPr>
+        <w:tc>
+          <w:tcPr>
+            <w:tcW w:type="dxa" w:w="1550"/>
+            <w:tcBorders>
+              <w:top w:val="single" w:color="C9CDD3" w:sz="3"/>
+              <w:left w:val="single" w:color="C9CDD3" w:sz="3"/>
+              <w:bottom w:val="single" w:color="C9CDD3" w:sz="3"/>
+              <w:right w:val="single" w:color="C9CDD3" w:sz="3"/>
+            </w:tcBorders>
+            <w:tcMar>
+              <w:top w:type="dxa" w:w="10"/>
+              <w:left w:type="dxa" w:w="42"/>
+              <w:bottom w:type="dxa" w:w="10"/>
+              <w:right w:type="dxa" w:w="42"/>
+            </w:tcMar>
+          </w:tcPr>
+          <w:p>
+            <w:pPr>
+              <w:spacing w:after="0" w:before="0" w:line="196"/>
+            </w:pPr>
+            <w:r>
+              <w:rPr>
+                <w:rFonts w:ascii="Calibri" w:cs="Calibri" w:eastAsia="Calibri" w:hAnsi="Calibri"/>
+                <w:sz w:val="13"/>
+                <w:szCs w:val="13"/>
+              </w:rPr>
+              <w:t xml:space="preserve">PRE_ARR · start → T_arr</w:t>
+            </w:r>
+          </w:p>
+        </w:tc>
+        <w:tc>
+          <w:tcPr>
+            <w:tcW w:type="dxa" w:w="8266"/>
+            <w:tcBorders>
+              <w:top w:val="single" w:color="C9CDD3" w:sz="3"/>
+              <w:left w:val="single" w:color="C9CDD3" w:sz="3"/>
+              <w:bottom w:val="single" w:color="C9CDD3" w:sz="3"/>
+              <w:right w:val="single" w:color="C9CDD3" w:sz="3"/>
+            </w:tcBorders>
+            <w:tcMar>
+              <w:top w:type="dxa" w:w="10"/>
+              <w:left w:type="dxa" w:w="42"/>
+              <w:bottom w:type="dxa" w:w="10"/>
+              <w:right w:type="dxa" w:w="42"/>
+            </w:tcMar>
+          </w:tcPr>
+          <w:p>
+            <w:pPr>
+              <w:spacing w:after="0" w:before="0" w:line="196"/>
+            </w:pPr>
+            <w:r>
+              <w:rPr>
+                <w:rFonts w:ascii="Calibri" w:cs="Calibri" w:eastAsia="Calibri" w:hAnsi="Calibri"/>
+                <w:sz w:val="13"/>
+                <w:szCs w:val="13"/>
+              </w:rPr>
+              <w:t xml:space="preserve">chocks-and-cones (LOOKBACK, rows, 0.1) · crew-present (LOOKBACK, rows, 0.5) · FOD walk (LOOKBACK, pixels, MoveNet, 1.3) · huddle (LOOKBACK, pixels, no model, 0.9) · lead-marshaller (LOOKBACK, pixels, HRNet, 2.5) · safety-zone (T_arr − 2 min → T_arr, two passes, MobileSAM + own tracker, RETHINK)</w:t>
+            </w:r>
+          </w:p>
+        </w:tc>
+        <w:tc>
+          <w:tcPr>
+            <w:tcW w:type="dxa" w:w="1050"/>
+            <w:tcBorders>
+              <w:top w:val="single" w:color="C9CDD3" w:sz="3"/>
+              <w:left w:val="single" w:color="C9CDD3" w:sz="3"/>
+              <w:bottom w:val="single" w:color="C9CDD3" w:sz="3"/>
+              <w:right w:val="single" w:color="C9CDD3" w:sz="3"/>
+            </w:tcBorders>
+            <w:tcMar>
+              <w:top w:type="dxa" w:w="10"/>
+              <w:left w:type="dxa" w:w="42"/>
+              <w:bottom w:type="dxa" w:w="10"/>
+              <w:right w:type="dxa" w:w="42"/>
+            </w:tcMar>
+          </w:tcPr>
+          <w:p>
+            <w:pPr>
+              <w:spacing w:after="0" w:before="0" w:line="196"/>
+            </w:pPr>
+            <w:r>
+              <w:rPr>
+                <w:rFonts w:ascii="Calibri" w:cs="Calibri" w:eastAsia="Calibri" w:hAnsi="Calibri"/>
+                <w:sz w:val="13"/>
+                <w:szCs w:val="13"/>
+              </w:rPr>
+              <w:t xml:space="preserve">51.7 (vests 28.2 of it)</w:t>
+            </w:r>
+          </w:p>
+        </w:tc>
+      </w:tr>
+      <w:tr>
+        <w:trPr>
+          <w:tblHeader w:val="off"/>
+        </w:trPr>
+        <w:tc>
+          <w:tcPr>
+            <w:tcW w:type="dxa" w:w="1550"/>
+            <w:tcBorders>
+              <w:top w:val="single" w:color="C9CDD3" w:sz="3"/>
+              <w:left w:val="single" w:color="C9CDD3" w:sz="3"/>
+              <w:bottom w:val="single" w:color="C9CDD3" w:sz="3"/>
+              <w:right w:val="single" w:color="C9CDD3" w:sz="3"/>
+            </w:tcBorders>
+            <w:tcMar>
+              <w:top w:type="dxa" w:w="10"/>
+              <w:left w:type="dxa" w:w="42"/>
+              <w:bottom w:type="dxa" w:w="10"/>
+              <w:right w:type="dxa" w:w="42"/>
+            </w:tcMar>
+          </w:tcPr>
+          <w:p>
+            <w:pPr>
+              <w:spacing w:after="0" w:before="0" w:line="196"/>
+            </w:pPr>
+            <w:r>
+              <w:rPr>
+                <w:rFonts w:ascii="Calibri" w:cs="Calibri" w:eastAsia="Calibri" w:hAnsi="Calibri"/>
+                <w:sz w:val="13"/>
+                <w:szCs w:val="13"/>
+              </w:rPr>
+              <w:t xml:space="preserve">ARR_POST · T_arr → …</w:t>
+            </w:r>
+          </w:p>
+        </w:tc>
+        <w:tc>
+          <w:tcPr>
+            <w:tcW w:type="dxa" w:w="8266"/>
+            <w:tcBorders>
+              <w:top w:val="single" w:color="C9CDD3" w:sz="3"/>
+              <w:left w:val="single" w:color="C9CDD3" w:sz="3"/>
+              <w:bottom w:val="single" w:color="C9CDD3" w:sz="3"/>
+              <w:right w:val="single" w:color="C9CDD3" w:sz="3"/>
+            </w:tcBorders>
+            <w:tcMar>
+              <w:top w:type="dxa" w:w="10"/>
+              <w:left w:type="dxa" w:w="42"/>
+              <w:bottom w:type="dxa" w:w="10"/>
+              <w:right w:type="dxa" w:w="42"/>
+            </w:tcMar>
+          </w:tcPr>
+          <w:p>
+            <w:pPr>
+              <w:spacing w:after="0" w:before="0" w:line="196"/>
+            </w:pPr>
+            <w:r>
+              <w:rPr>
+                <w:rFonts w:ascii="Calibri" w:cs="Calibri" w:eastAsia="Calibri" w:hAnsi="Calibri"/>
+                <w:sz w:val="13"/>
+                <w:szCs w:val="13"/>
+              </w:rPr>
+              <w:t xml:space="preserve">cones-placed (DEADLINE T_arr + limit, rows, 0.6) · steering (DEADLINE T_arr + 240 s, pixels, HRNet + InceptionTime, 0.7) · hand-signals (T_arr → GSE at the door, two passes, HRNet, RETHINK) · nose gear chocks (within 30 s of the stop; aircraft-chocks, two passes, EfficientNet difference) · post-arrival walk-around (WHOLE, POST, own environment)</w:t>
+            </w:r>
+          </w:p>
+        </w:tc>
+        <w:tc>
+          <w:tcPr>
+            <w:tcW w:type="dxa" w:w="1050"/>
+            <w:tcBorders>
+              <w:top w:val="single" w:color="C9CDD3" w:sz="3"/>
+              <w:left w:val="single" w:color="C9CDD3" w:sz="3"/>
+              <w:bottom w:val="single" w:color="C9CDD3" w:sz="3"/>
+              <w:right w:val="single" w:color="C9CDD3" w:sz="3"/>
+            </w:tcBorders>
+            <w:tcMar>
+              <w:top w:type="dxa" w:w="10"/>
+              <w:left w:type="dxa" w:w="42"/>
+              <w:bottom w:type="dxa" w:w="10"/>
+              <w:right w:type="dxa" w:w="42"/>
+            </w:tcMar>
+          </w:tcPr>
+          <w:p>
+            <w:pPr>
+              <w:spacing w:after="0" w:before="0" w:line="196"/>
+            </w:pPr>
+            <w:r>
+              <w:rPr>
+                <w:rFonts w:ascii="Calibri" w:cs="Calibri" w:eastAsia="Calibri" w:hAnsi="Calibri"/>
+                <w:sz w:val="13"/>
+                <w:szCs w:val="13"/>
+              </w:rPr>
+              <w:t xml:space="preserve">48.2 (+6.8 post)</w:t>
+            </w:r>
+          </w:p>
+        </w:tc>
+      </w:tr>
+      <w:tr>
+        <w:trPr>
+          <w:tblHeader w:val="off"/>
+        </w:trPr>
+        <w:tc>
+          <w:tcPr>
+            <w:tcW w:type="dxa" w:w="1550"/>
+            <w:tcBorders>
+              <w:top w:val="single" w:color="C9CDD3" w:sz="3"/>
+              <w:left w:val="single" w:color="C9CDD3" w:sz="3"/>
+              <w:bottom w:val="single" w:color="C9CDD3" w:sz="3"/>
+              <w:right w:val="single" w:color="C9CDD3" w:sz="3"/>
+            </w:tcBorders>
+            <w:tcMar>
+              <w:top w:type="dxa" w:w="10"/>
+              <w:left w:type="dxa" w:w="42"/>
+              <w:bottom w:type="dxa" w:w="10"/>
+              <w:right w:type="dxa" w:w="42"/>
+            </w:tcMar>
+          </w:tcPr>
+          <w:p>
+            <w:pPr>
+              <w:spacing w:after="0" w:before="0" w:line="196"/>
+            </w:pPr>
+            <w:r>
+              <w:rPr>
+                <w:rFonts w:ascii="Calibri" w:cs="Calibri" w:eastAsia="Calibri" w:hAnsi="Calibri"/>
+                <w:sz w:val="13"/>
+                <w:szCs w:val="13"/>
+              </w:rPr>
+              <w:t xml:space="preserve">DOWNLOAD · BL appears → BL leaves</w:t>
+            </w:r>
+          </w:p>
+        </w:tc>
+        <w:tc>
+          <w:tcPr>
+            <w:tcW w:type="dxa" w:w="8266"/>
+            <w:tcBorders>
+              <w:top w:val="single" w:color="C9CDD3" w:sz="3"/>
+              <w:left w:val="single" w:color="C9CDD3" w:sz="3"/>
+              <w:bottom w:val="single" w:color="C9CDD3" w:sz="3"/>
+              <w:right w:val="single" w:color="C9CDD3" w:sz="3"/>
+            </w:tcBorders>
+            <w:tcMar>
+              <w:top w:type="dxa" w:w="10"/>
+              <w:left w:type="dxa" w:w="42"/>
+              <w:bottom w:type="dxa" w:w="10"/>
+              <w:right w:type="dxa" w:w="42"/>
+            </w:tcMar>
+          </w:tcPr>
+          <w:p>
+            <w:pPr>
+              <w:spacing w:after="0" w:before="0" w:line="196"/>
+            </w:pPr>
+            <w:r>
+              <w:rPr>
+                <w:rFonts w:ascii="Calibri" w:cs="Calibri" w:eastAsia="Calibri" w:hAnsi="Calibri"/>
+                <w:sz w:val="13"/>
+                <w:szCs w:val="13"/>
+              </w:rPr>
+              <w:t xml:space="preserve">3-stop (BL appeared → stopped at the door, intersection &gt; 0.2; EVENT, rows, 0.6) · beltloader-chocks (BL at door → drove away, EVENT, rows, 0.3) · bl_rear_cone (EVENT, rows, 0.4) · cargo doors (DEADLINE end of stage / 480 frames, rows, 0.9) · gse-chocks (GSE stopped → drove away, EVENT, pixels, RTMPose + EfficientNet, 3.3, session end) · handrails-on-gse (BL at door → worker off the BL, EVENT, pixels, four networks, 12.5, session end) · safety-handrails (BL at door → drove away, EVENT, pixels, EfficientNet, 2.4)</w:t>
+            </w:r>
+          </w:p>
+        </w:tc>
+        <w:tc>
+          <w:tcPr>
+            <w:tcW w:type="dxa" w:w="1050"/>
+            <w:tcBorders>
+              <w:top w:val="single" w:color="C9CDD3" w:sz="3"/>
+              <w:left w:val="single" w:color="C9CDD3" w:sz="3"/>
+              <w:bottom w:val="single" w:color="C9CDD3" w:sz="3"/>
+              <w:right w:val="single" w:color="C9CDD3" w:sz="3"/>
+            </w:tcBorders>
+            <w:tcMar>
+              <w:top w:type="dxa" w:w="10"/>
+              <w:left w:type="dxa" w:w="42"/>
+              <w:bottom w:type="dxa" w:w="10"/>
+              <w:right w:type="dxa" w:w="42"/>
+            </w:tcMar>
+          </w:tcPr>
+          <w:p>
+            <w:pPr>
+              <w:spacing w:after="0" w:before="0" w:line="196"/>
+            </w:pPr>
+            <w:r>
+              <w:rPr>
+                <w:rFonts w:ascii="Calibri" w:cs="Calibri" w:eastAsia="Calibri" w:hAnsi="Calibri"/>
+                <w:b/>
+                <w:bCs/>
+                <w:sz w:val="13"/>
+                <w:szCs w:val="13"/>
+              </w:rPr>
+              <w:t xml:space="preserve">89.0</w:t>
+            </w:r>
+            <w:r>
+              <w:rPr>
+                <w:rFonts w:ascii="Calibri" w:cs="Calibri" w:eastAsia="Calibri" w:hAnsi="Calibri"/>
+                <w:sz w:val="13"/>
+                <w:szCs w:val="13"/>
+              </w:rPr>
+              <w:t xml:space="preserve"> — the peak, 3–4× the budget</w:t>
+            </w:r>
+          </w:p>
+        </w:tc>
+      </w:tr>
+      <w:tr>
+        <w:trPr>
+          <w:tblHeader w:val="off"/>
+        </w:trPr>
+        <w:tc>
+          <w:tcPr>
+            <w:tcW w:type="dxa" w:w="1550"/>
+            <w:tcBorders>
+              <w:top w:val="single" w:color="C9CDD3" w:sz="3"/>
+              <w:left w:val="single" w:color="C9CDD3" w:sz="3"/>
+              <w:bottom w:val="single" w:color="C9CDD3" w:sz="3"/>
+              <w:right w:val="single" w:color="C9CDD3" w:sz="3"/>
+            </w:tcBorders>
+            <w:tcMar>
+              <w:top w:type="dxa" w:w="10"/>
+              <w:left w:type="dxa" w:w="42"/>
+              <w:bottom w:type="dxa" w:w="10"/>
+              <w:right w:type="dxa" w:w="42"/>
+            </w:tcMar>
+          </w:tcPr>
+          <w:p>
+            <w:pPr>
+              <w:spacing w:after="0" w:before="0" w:line="196"/>
+            </w:pPr>
+            <w:r>
+              <w:rPr>
+                <w:rFonts w:ascii="Calibri" w:cs="Calibri" w:eastAsia="Calibri" w:hAnsi="Calibri"/>
+                <w:sz w:val="13"/>
+                <w:szCs w:val="13"/>
+              </w:rPr>
+              <w:t xml:space="preserve">PRE_DEP · BL leave → T_dep</w:t>
+            </w:r>
+          </w:p>
+        </w:tc>
+        <w:tc>
+          <w:tcPr>
+            <w:tcW w:type="dxa" w:w="8266"/>
+            <w:tcBorders>
+              <w:top w:val="single" w:color="C9CDD3" w:sz="3"/>
+              <w:left w:val="single" w:color="C9CDD3" w:sz="3"/>
+              <w:bottom w:val="single" w:color="C9CDD3" w:sz="3"/>
+              <w:right w:val="single" w:color="C9CDD3" w:sz="3"/>
+            </w:tcBorders>
+            <w:tcMar>
+              <w:top w:type="dxa" w:w="10"/>
+              <w:left w:type="dxa" w:w="42"/>
+              <w:bottom w:type="dxa" w:w="10"/>
+              <w:right w:type="dxa" w:w="42"/>
+            </w:tcMar>
+          </w:tcPr>
+          <w:p>
+            <w:pPr>
+              <w:spacing w:after="0" w:before="0" w:line="196"/>
+            </w:pPr>
+            <w:r>
+              <w:rPr>
+                <w:rFonts w:ascii="Calibri" w:cs="Calibri" w:eastAsia="Calibri" w:hAnsi="Calibri"/>
+                <w:sz w:val="13"/>
+                <w:szCs w:val="13"/>
+              </w:rPr>
+              <w:t xml:space="preserve">conditioned-air (LOOKBACK T_dep − 10 min, pixels, YOLO-seg every 16th frame, 1.3) · cones-removed (EVENT BL leave → T_dep, rows, 1.5) · pin-verification (BL leave → pushback attached, two passes, SimCC pose, PATCH) · main-gear and nose-wheel chock removal (after pushback attached; aircraft-chocks, two passes) · pre-departure walk-around (WHOLE, POST, own environment)</w:t>
+            </w:r>
+          </w:p>
+        </w:tc>
+        <w:tc>
+          <w:tcPr>
+            <w:tcW w:type="dxa" w:w="1050"/>
+            <w:tcBorders>
+              <w:top w:val="single" w:color="C9CDD3" w:sz="3"/>
+              <w:left w:val="single" w:color="C9CDD3" w:sz="3"/>
+              <w:bottom w:val="single" w:color="C9CDD3" w:sz="3"/>
+              <w:right w:val="single" w:color="C9CDD3" w:sz="3"/>
+            </w:tcBorders>
+            <w:tcMar>
+              <w:top w:type="dxa" w:w="10"/>
+              <w:left w:type="dxa" w:w="42"/>
+              <w:bottom w:type="dxa" w:w="10"/>
+              <w:right w:type="dxa" w:w="42"/>
+            </w:tcMar>
+          </w:tcPr>
+          <w:p>
+            <w:pPr>
+              <w:spacing w:after="0" w:before="0" w:line="196"/>
+            </w:pPr>
+            <w:r>
+              <w:rPr>
+                <w:rFonts w:ascii="Calibri" w:cs="Calibri" w:eastAsia="Calibri" w:hAnsi="Calibri"/>
+                <w:sz w:val="13"/>
+                <w:szCs w:val="13"/>
+              </w:rPr>
+              <w:t xml:space="preserve">45.1 (+26.1 post)</w:t>
+            </w:r>
+          </w:p>
+        </w:tc>
+      </w:tr>
+      <w:tr>
+        <w:trPr>
+          <w:tblHeader w:val="off"/>
+        </w:trPr>
+        <w:tc>
+          <w:tcPr>
+            <w:tcW w:type="dxa" w:w="1550"/>
+            <w:tcBorders>
+              <w:top w:val="single" w:color="C9CDD3" w:sz="3"/>
+              <w:left w:val="single" w:color="C9CDD3" w:sz="3"/>
+              <w:bottom w:val="single" w:color="C9CDD3" w:sz="3"/>
+              <w:right w:val="single" w:color="C9CDD3" w:sz="3"/>
+            </w:tcBorders>
+            <w:tcMar>
+              <w:top w:type="dxa" w:w="10"/>
+              <w:left w:type="dxa" w:w="42"/>
+              <w:bottom w:type="dxa" w:w="10"/>
+              <w:right w:type="dxa" w:w="42"/>
+            </w:tcMar>
+          </w:tcPr>
+          <w:p>
+            <w:pPr>
+              <w:spacing w:after="0" w:before="0" w:line="196"/>
+            </w:pPr>
+            <w:r>
+              <w:rPr>
+                <w:rFonts w:ascii="Calibri" w:cs="Calibri" w:eastAsia="Calibri" w:hAnsi="Calibri"/>
+                <w:sz w:val="13"/>
+                <w:szCs w:val="13"/>
+              </w:rPr>
+              <w:t xml:space="preserve">DEP · pushback → T_dep + 60 s</w:t>
+            </w:r>
+          </w:p>
+        </w:tc>
+        <w:tc>
+          <w:tcPr>
+            <w:tcW w:type="dxa" w:w="8266"/>
+            <w:tcBorders>
+              <w:top w:val="single" w:color="C9CDD3" w:sz="3"/>
+              <w:left w:val="single" w:color="C9CDD3" w:sz="3"/>
+              <w:bottom w:val="single" w:color="C9CDD3" w:sz="3"/>
+              <w:right w:val="single" w:color="C9CDD3" w:sz="3"/>
+            </w:tcBorders>
+            <w:tcMar>
+              <w:top w:type="dxa" w:w="10"/>
+              <w:left w:type="dxa" w:w="42"/>
+              <w:bottom w:type="dxa" w:w="10"/>
+              <w:right w:type="dxa" w:w="42"/>
+            </w:tcMar>
+          </w:tcPr>
+          <w:p>
+            <w:pPr>
+              <w:spacing w:after="0" w:before="0" w:line="196"/>
+            </w:pPr>
+            <w:r>
+              <w:rPr>
+                <w:rFonts w:ascii="Calibri" w:cs="Calibri" w:eastAsia="Calibri" w:hAnsi="Calibri"/>
+                <w:sz w:val="13"/>
+                <w:szCs w:val="13"/>
+              </w:rPr>
+              <w:t xml:space="preserve">pushback wing walkers (pushback attached → started moving, EVENT, rows, 0.3) · pushback-pathway (T_dep − 45 s → T_dep, INSTANT, rows, 0.5) · wing-walkers (T_dep − preparation → T_dep + 60 s, LOOKBACK, pixels, HRNet, 5.1)</w:t>
+            </w:r>
+          </w:p>
+        </w:tc>
+        <w:tc>
+          <w:tcPr>
+            <w:tcW w:type="dxa" w:w="1050"/>
+            <w:tcBorders>
+              <w:top w:val="single" w:color="C9CDD3" w:sz="3"/>
+              <w:left w:val="single" w:color="C9CDD3" w:sz="3"/>
+              <w:bottom w:val="single" w:color="C9CDD3" w:sz="3"/>
+              <w:right w:val="single" w:color="C9CDD3" w:sz="3"/>
+            </w:tcBorders>
+            <w:tcMar>
+              <w:top w:type="dxa" w:w="10"/>
+              <w:left w:type="dxa" w:w="42"/>
+              <w:bottom w:type="dxa" w:w="10"/>
+              <w:right w:type="dxa" w:w="42"/>
+            </w:tcMar>
+          </w:tcPr>
+          <w:p>
+            <w:pPr>
+              <w:spacing w:after="0" w:before="0" w:line="196"/>
+            </w:pPr>
+            <w:r>
+              <w:rPr>
+                <w:rFonts w:ascii="Calibri" w:cs="Calibri" w:eastAsia="Calibri" w:hAnsi="Calibri"/>
+                <w:sz w:val="13"/>
+                <w:szCs w:val="13"/>
+              </w:rPr>
+              <w:t xml:space="preserve">42.9</w:t>
+            </w:r>
+          </w:p>
+        </w:tc>
+      </w:tr>
+      <w:tr>
+        <w:trPr>
+          <w:tblHeader w:val="off"/>
+        </w:trPr>
+        <w:tc>
+          <w:tcPr>
+            <w:tcW w:type="dxa" w:w="1550"/>
+            <w:tcBorders>
+              <w:top w:val="single" w:color="C9CDD3" w:sz="3"/>
+              <w:left w:val="single" w:color="C9CDD3" w:sz="3"/>
+              <w:bottom w:val="single" w:color="C9CDD3" w:sz="3"/>
+              <w:right w:val="single" w:color="C9CDD3" w:sz="3"/>
+            </w:tcBorders>
+            <w:tcMar>
+              <w:top w:type="dxa" w:w="10"/>
+              <w:left w:type="dxa" w:w="42"/>
+              <w:bottom w:type="dxa" w:w="10"/>
+              <w:right w:type="dxa" w:w="42"/>
+            </w:tcMar>
+          </w:tcPr>
+          <w:p>
+            <w:pPr>
+              <w:spacing w:after="0" w:before="0" w:line="196"/>
+            </w:pPr>
+            <w:r>
+              <w:rPr>
+                <w:rFonts w:ascii="Calibri" w:cs="Calibri" w:eastAsia="Calibri" w:hAnsi="Calibri"/>
+                <w:sz w:val="13"/>
+                <w:szCs w:val="13"/>
+              </w:rPr>
+              <w:t xml:space="preserve">ALL · start → end</w:t>
+            </w:r>
+          </w:p>
+        </w:tc>
+        <w:tc>
+          <w:tcPr>
+            <w:tcW w:type="dxa" w:w="8266"/>
+            <w:tcBorders>
+              <w:top w:val="single" w:color="C9CDD3" w:sz="3"/>
+              <w:left w:val="single" w:color="C9CDD3" w:sz="3"/>
+              <w:bottom w:val="single" w:color="C9CDD3" w:sz="3"/>
+              <w:right w:val="single" w:color="C9CDD3" w:sz="3"/>
+            </w:tcBorders>
+            <w:tcMar>
+              <w:top w:type="dxa" w:w="10"/>
+              <w:left w:type="dxa" w:w="42"/>
+              <w:bottom w:type="dxa" w:w="10"/>
+              <w:right w:type="dxa" w:w="42"/>
+            </w:tcMar>
+          </w:tcPr>
+          <w:p>
+            <w:pPr>
+              <w:spacing w:after="0" w:before="0" w:line="196"/>
+            </w:pPr>
+            <w:r>
+              <w:rPr>
+                <w:rFonts w:ascii="Calibri" w:cs="Calibri" w:eastAsia="Calibri" w:hAnsi="Calibri"/>
+                <w:sz w:val="13"/>
+                <w:szCs w:val="13"/>
+              </w:rPr>
+              <w:t xml:space="preserve">safety-vests (INSTANT: an unzipped vest → Fail, but the client verdict only at session end; pixels, two Swin-T + ResNet-18, 18.8, the only check free of the aircraft and the stage) · hair-policy (WSL, CPU, not hosted)</w:t>
+            </w:r>
+          </w:p>
+        </w:tc>
+        <w:tc>
+          <w:tcPr>
+            <w:tcW w:type="dxa" w:w="1050"/>
+            <w:tcBorders>
+              <w:top w:val="single" w:color="C9CDD3" w:sz="3"/>
+              <w:left w:val="single" w:color="C9CDD3" w:sz="3"/>
+              <w:bottom w:val="single" w:color="C9CDD3" w:sz="3"/>
+              <w:right w:val="single" w:color="C9CDD3" w:sz="3"/>
+            </w:tcBorders>
+            <w:tcMar>
+              <w:top w:type="dxa" w:w="10"/>
+              <w:left w:type="dxa" w:w="42"/>
+              <w:bottom w:type="dxa" w:w="10"/>
+              <w:right w:type="dxa" w:w="42"/>
+            </w:tcMar>
+          </w:tcPr>
+          <w:p>
+            <w:pPr>
+              <w:spacing w:after="0" w:before="0" w:line="196"/>
+            </w:pPr>
+            <w:r>
+              <w:rPr>
+                <w:rFonts w:ascii="Calibri" w:cs="Calibri" w:eastAsia="Calibri" w:hAnsi="Calibri"/>
+                <w:sz w:val="13"/>
+                <w:szCs w:val="13"/>
+              </w:rPr>
+              <w:t xml:space="preserve">28.2 all session</w:t>
+            </w:r>
+          </w:p>
+        </w:tc>
+      </w:tr>
+    </w:tbl>
     <w:p>
       <w:pPr>
         <w:spacing w:after="0" w:before="16" w:line="204"/>

</xml_diff>